<commit_message>
walk in feature | download cert validation
</commit_message>
<xml_diff>
--- a/storage/word_templates/BARANGAY_CLEARANCE_TEMPLATE.docx
+++ b/storage/word_templates/BARANGAY_CLEARANCE_TEMPLATE.docx
@@ -111,21 +111,7 @@
           <w:sz w:val="28"/>
         </w:rPr>
         <w:tab/>
-        <w:t>THIS IS TO CERTIFY that ${resident_name}, Residing at ${resident_</w:t>
-      </w:r>
-      <w:r>
-        <w:rPr>
-          <w:rFonts w:ascii="Cambria" w:hAnsi="Cambria" w:asciiTheme="majorHAnsi" w:hAnsiTheme="majorHAnsi"/>
-          <w:sz w:val="28"/>
-        </w:rPr>
-        <w:t>address</w:t>
-      </w:r>
-      <w:r>
-        <w:rPr>
-          <w:rFonts w:ascii="Cambria" w:hAnsi="Cambria" w:asciiTheme="majorHAnsi" w:hAnsiTheme="majorHAnsi"/>
-          <w:sz w:val="28"/>
-        </w:rPr>
-        <w:t xml:space="preserve">}. He/She is known to me to be a Good Moral Character in this Community. </w:t>
+        <w:t xml:space="preserve">THIS IS TO CERTIFY that ${resident_name}, Residing at ${resident_address}. He/She is known to me to be a Good Moral Character in this Community. </w:t>
       </w:r>
     </w:p>
     <w:p>
@@ -616,49 +602,7 @@
     <w:pPr>
       <w:pStyle w:val="Normal"/>
       <w:spacing w:before="0" w:after="0"/>
-      <w:ind w:firstLine="720" w:left="2880"/>
-      <w:rPr>
-        <w:rFonts w:ascii="Cambria" w:hAnsi="Cambria" w:asciiTheme="majorHAnsi" w:hAnsiTheme="majorHAnsi"/>
-        <w:color w:val="222A35"/>
-        <w:sz w:val="20"/>
-        <w:szCs w:val="14"/>
-      </w:rPr>
-    </w:pPr>
-    <w:r>
-      <w:rPr>
-        <w:rFonts w:asciiTheme="majorHAnsi" w:hAnsiTheme="majorHAnsi" w:ascii="Cambria" w:hAnsi="Cambria"/>
-        <w:color w:val="222A35"/>
-        <w:sz w:val="20"/>
-        <w:szCs w:val="14"/>
-      </w:rPr>
-    </w:r>
-  </w:p>
-  <w:p>
-    <w:pPr>
-      <w:pStyle w:val="Normal"/>
-      <w:spacing w:before="0" w:after="0"/>
-      <w:ind w:firstLine="720" w:left="2880"/>
-      <w:rPr>
-        <w:rFonts w:ascii="Cambria" w:hAnsi="Cambria" w:asciiTheme="majorHAnsi" w:hAnsiTheme="majorHAnsi"/>
-        <w:color w:val="222A35"/>
-        <w:sz w:val="20"/>
-        <w:szCs w:val="14"/>
-      </w:rPr>
-    </w:pPr>
-    <w:r>
-      <w:rPr>
-        <w:rFonts w:asciiTheme="majorHAnsi" w:hAnsiTheme="majorHAnsi" w:ascii="Cambria" w:hAnsi="Cambria"/>
-        <w:color w:val="222A35"/>
-        <w:sz w:val="20"/>
-        <w:szCs w:val="14"/>
-      </w:rPr>
-    </w:r>
-  </w:p>
-  <w:p>
-    <w:pPr>
-      <w:pStyle w:val="Normal"/>
-      <w:spacing w:before="0" w:after="0"/>
-      <w:ind w:firstLine="720" w:left="2880"/>
+      <w:ind w:hanging="0" w:left="2880"/>
       <w:rPr>
         <w:rFonts w:ascii="Cambria" w:hAnsi="Cambria" w:asciiTheme="majorHAnsi" w:hAnsiTheme="majorHAnsi"/>
         <w:color w:val="222A35"/>
@@ -716,10 +660,9 @@
       <w:rPr>
         <w:rFonts w:ascii="Cambria" w:hAnsi="Cambria" w:asciiTheme="majorHAnsi" w:hAnsiTheme="majorHAnsi"/>
         <w:color w:val="222A35"/>
-        <w:sz w:val="20"/>
         <w:szCs w:val="14"/>
       </w:rPr>
-      <w:t xml:space="preserve"> </w:t>
+      <w:t xml:space="preserve">      </w:t>
     </w:r>
     <w:r>
       <w:rPr>
@@ -897,49 +840,7 @@
     <w:pPr>
       <w:pStyle w:val="Normal"/>
       <w:spacing w:before="0" w:after="0"/>
-      <w:ind w:firstLine="720" w:left="2880"/>
-      <w:rPr>
-        <w:rFonts w:ascii="Cambria" w:hAnsi="Cambria" w:asciiTheme="majorHAnsi" w:hAnsiTheme="majorHAnsi"/>
-        <w:color w:val="222A35"/>
-        <w:sz w:val="20"/>
-        <w:szCs w:val="14"/>
-      </w:rPr>
-    </w:pPr>
-    <w:r>
-      <w:rPr>
-        <w:rFonts w:asciiTheme="majorHAnsi" w:hAnsiTheme="majorHAnsi" w:ascii="Cambria" w:hAnsi="Cambria"/>
-        <w:color w:val="222A35"/>
-        <w:sz w:val="20"/>
-        <w:szCs w:val="14"/>
-      </w:rPr>
-    </w:r>
-  </w:p>
-  <w:p>
-    <w:pPr>
-      <w:pStyle w:val="Normal"/>
-      <w:spacing w:before="0" w:after="0"/>
-      <w:ind w:firstLine="720" w:left="2880"/>
-      <w:rPr>
-        <w:rFonts w:ascii="Cambria" w:hAnsi="Cambria" w:asciiTheme="majorHAnsi" w:hAnsiTheme="majorHAnsi"/>
-        <w:color w:val="222A35"/>
-        <w:sz w:val="20"/>
-        <w:szCs w:val="14"/>
-      </w:rPr>
-    </w:pPr>
-    <w:r>
-      <w:rPr>
-        <w:rFonts w:asciiTheme="majorHAnsi" w:hAnsiTheme="majorHAnsi" w:ascii="Cambria" w:hAnsi="Cambria"/>
-        <w:color w:val="222A35"/>
-        <w:sz w:val="20"/>
-        <w:szCs w:val="14"/>
-      </w:rPr>
-    </w:r>
-  </w:p>
-  <w:p>
-    <w:pPr>
-      <w:pStyle w:val="Normal"/>
-      <w:spacing w:before="0" w:after="0"/>
-      <w:ind w:firstLine="720" w:left="2880"/>
+      <w:ind w:hanging="0" w:left="2880"/>
       <w:rPr>
         <w:rFonts w:ascii="Cambria" w:hAnsi="Cambria" w:asciiTheme="majorHAnsi" w:hAnsiTheme="majorHAnsi"/>
         <w:color w:val="222A35"/>
@@ -997,10 +898,9 @@
       <w:rPr>
         <w:rFonts w:ascii="Cambria" w:hAnsi="Cambria" w:asciiTheme="majorHAnsi" w:hAnsiTheme="majorHAnsi"/>
         <w:color w:val="222A35"/>
-        <w:sz w:val="20"/>
         <w:szCs w:val="14"/>
       </w:rPr>
-      <w:t xml:space="preserve"> </w:t>
+      <w:t xml:space="preserve">      </w:t>
     </w:r>
     <w:r>
       <w:rPr>

</xml_diff>